<commit_message>
Add Fig 2b (p_spill by DST mode) and Fig 3b (policy params vs SE)
- plots/fig2b_pspill_analysis.png: violin of per-frame p_spill split by
  {M0-fixed, M2-FAST, M2-SAFE, M1-fixed} + speed vs p_spill scatter with
  resolution as dot size. Shows DST switch cuts spill risk 13x within M2.
- plots/fig3b_params_vs_se.png: 3-panel scatter of speed / resolution /
  inflation vs per-run SE for all 180 runs. Shows no single parameter
  predicts SE; M2's medical_care analogy occupies a unique parameter
  position (finest resolution 0.04, balanced speed/inflation).
- Report docx/pdf updated: both figures inserted after Fig 2 and Fig 3
  respectively, with full What-shows / Conclude / Connection text blocks.

Co-Authored-By: Claude Sonnet 4.6 <noreply@anthropic.com>
</commit_message>
<xml_diff>
--- a/Robot_Delivery_Research_Report.docx
+++ b/Robot_Delivery_Research_Report.docx
@@ -2851,6 +2851,148 @@
     </w:p>
     <w:p>
       <w:pPr>
+        <w:pBdr>
+          <w:bottom w:val="single" w:sz="4" w:space="1" w:color="AAAAAA"/>
+        </w:pBdr>
+        <w:spacing w:after="160"/>
+      </w:pPr>
+    </w:p>
+    <w:p>
+      <w:pPr>
+        <w:spacing w:before="120"/>
+        <w:jc w:val="center"/>
+      </w:pPr>
+      <w:r>
+        <w:drawing>
+          <wp:inline xmlns:a="http://schemas.openxmlformats.org/drawingml/2006/main" xmlns:pic="http://schemas.openxmlformats.org/drawingml/2006/picture">
+            <wp:extent cx="5943600" cy="2547257"/>
+            <wp:docPr id="18" name="Picture 18"/>
+            <wp:cNvGraphicFramePr>
+              <a:graphicFrameLocks noChangeAspect="1"/>
+            </wp:cNvGraphicFramePr>
+            <a:graphic>
+              <a:graphicData uri="http://schemas.openxmlformats.org/drawingml/2006/picture">
+                <pic:pic>
+                  <pic:nvPicPr>
+                    <pic:cNvPr id="0" name="fig2b_pspill_analysis.png"/>
+                    <pic:cNvPicPr/>
+                  </pic:nvPicPr>
+                  <pic:blipFill>
+                    <a:blip r:embed="rId26"/>
+                    <a:stretch>
+                      <a:fillRect/>
+                    </a:stretch>
+                  </pic:blipFill>
+                  <pic:spPr>
+                    <a:xfrm>
+                      <a:off x="0" y="0"/>
+                      <a:ext cx="5943600" cy="2547257"/>
+                    </a:xfrm>
+                    <a:prstGeom prst="rect"/>
+                  </pic:spPr>
+                </pic:pic>
+              </a:graphicData>
+            </a:graphic>
+          </wp:inline>
+        </w:drawing>
+      </w:r>
+    </w:p>
+    <w:p>
+      <w:pPr>
+        <w:spacing w:before="40" w:after="120"/>
+        <w:jc w:val="center"/>
+      </w:pPr>
+      <w:r>
+        <w:rPr>
+          <w:i/>
+          <w:sz w:val="18"/>
+        </w:rPr>
+        <w:t>Fig 2b. Per-frame spill risk split by model and operating mode: p_spill violin distributions (left) and speed vs p_spill scatter with resolution encoded as dot size (right).</w:t>
+      </w:r>
+    </w:p>
+    <w:p>
+      <w:pPr>
+        <w:spacing w:before="120" w:after="40"/>
+        <w:ind w:left="283"/>
+      </w:pPr>
+      <w:r>
+        <w:rPr>
+          <w:b/>
+          <w:color w:val="143C6D"/>
+          <w:sz w:val="20"/>
+        </w:rPr>
+        <w:t>What this figure shows</w:t>
+      </w:r>
+    </w:p>
+    <w:p>
+      <w:pPr>
+        <w:spacing w:before="40" w:after="160"/>
+        <w:ind w:left="283" w:right="283"/>
+        <w:shd w:val="clear" w:color="auto" w:fill="F2F6FC"/>
+      </w:pPr>
+      <w:r>
+        <w:rPr>
+          <w:sz w:val="20"/>
+        </w:rPr>
+        <w:t xml:space="preserve">Fig 2b zooms inside the spill mechanism that Fig 2 summarises. Panel ① (left) shows violin distributions of per-frame p_spill on a log₁₀ scale for four groups: M0-Reactive (fixed fast policy), M2 in its FAST operating mode, M2 in its SAFE operating mode, and M1-Symbolic (fixed safe policy). Panel ② (right) plots effective speed against per-frame p_spill for all 54,000 telemetry frames; dot size encodes resolution coarseness (larger = coarser = more risk).</w:t>
+      </w:r>
+    </w:p>
+    <w:p>
+      <w:pPr>
+        <w:spacing w:before="120" w:after="40"/>
+        <w:ind w:left="283"/>
+      </w:pPr>
+      <w:r>
+        <w:rPr>
+          <w:b/>
+          <w:color w:val="143C6D"/>
+          <w:sz w:val="20"/>
+        </w:rPr>
+        <w:t>What we conclude</w:t>
+      </w:r>
+    </w:p>
+    <w:p>
+      <w:pPr>
+        <w:spacing w:before="40" w:after="160"/>
+        <w:ind w:left="283" w:right="283"/>
+        <w:shd w:val="clear" w:color="auto" w:fill="F2F6FC"/>
+      </w:pPr>
+      <w:r>
+        <w:rPr>
+          <w:sz w:val="20"/>
+        </w:rPr>
+        <w:t xml:space="preserve">Panel ① reveals the key result: M2-SAFE mode (dark green) sits at the same per-frame risk level as M1-Symbolic (median p_spill ≈ 0.0001) while M2-FAST mode (bright green) sits at the same level as M0-Reactive (median ≈ 0.0013–0.0017). The DST switch between FAST and SAFE cuts per-frame spill probability 13× within M2 — not marginally, but by more than an order of magnitude. Panel ② confirms the joint mechanism: higher speed and coarser resolution both push p_spill upward, while M1 and M2-SAFE cluster at low speed + fine resolution and stay well below 10⁻³. M0 spreads across high risk at high speed. M2-FAST occupies an intermediate position that is slightly safer than M0 despite comparable speed, because M2’s medical_care analogy targets resolution=0.04 m (finer than M0’s 0.10 m), smoothing the path and reducing proximity-based risk even in fast mode.</w:t>
+      </w:r>
+    </w:p>
+    <w:p>
+      <w:pPr>
+        <w:spacing w:before="120" w:after="40"/>
+        <w:ind w:left="283"/>
+      </w:pPr>
+      <w:r>
+        <w:rPr>
+          <w:b/>
+          <w:color w:val="143C6D"/>
+          <w:sz w:val="20"/>
+        </w:rPr>
+        <w:t>Connection to the research problem</w:t>
+      </w:r>
+    </w:p>
+    <w:p>
+      <w:pPr>
+        <w:spacing w:before="40" w:after="160"/>
+        <w:ind w:left="283" w:right="283"/>
+        <w:shd w:val="clear" w:color="auto" w:fill="F2F6FC"/>
+      </w:pPr>
+      <w:r>
+        <w:rPr>
+          <w:sz w:val="20"/>
+        </w:rPr>
+        <w:t xml:space="preserve">This figure provides the mechanistic link between Fig 2’s aggregate spill counts and Fig 4’s policy-mode fractions. Fig 4 showed M2 spends 95% of Domestic frames in FAST mode and 62% of Warehouse frames in SAFE mode. Fig 2b shows exactly what that means for safety: each frame in SAFE mode carries 13× less spill risk than a FAST-mode frame. M2’s DST switching is not cosmetic — it is a real-time risk management mechanism that deploys the conservative policy precisely when and where it is needed, and releases it to maintain efficiency when the path is clear. Fig 3b (next) shows how the three policy parameters — speed, resolution, and inflation — jointly shape the SE outcomes observed across all models and environments.</w:t>
+      </w:r>
+    </w:p>
+    <w:p>
+      <w:pPr>
         <w:spacing w:before="120"/>
         <w:jc w:val="center"/>
       </w:pPr>
@@ -2991,6 +3133,148 @@
         </w:pBdr>
         <w:spacing w:after="160"/>
       </w:pPr>
+    </w:p>
+    <w:p>
+      <w:pPr>
+        <w:pBdr>
+          <w:bottom w:val="single" w:sz="4" w:space="1" w:color="AAAAAA"/>
+        </w:pBdr>
+        <w:spacing w:after="160"/>
+      </w:pPr>
+    </w:p>
+    <w:p>
+      <w:pPr>
+        <w:spacing w:before="120"/>
+        <w:jc w:val="center"/>
+      </w:pPr>
+      <w:r>
+        <w:drawing>
+          <wp:inline xmlns:a="http://schemas.openxmlformats.org/drawingml/2006/main" xmlns:pic="http://schemas.openxmlformats.org/drawingml/2006/picture">
+            <wp:extent cx="5943600" cy="2377440"/>
+            <wp:docPr id="19" name="Picture 19"/>
+            <wp:cNvGraphicFramePr>
+              <a:graphicFrameLocks noChangeAspect="1"/>
+            </wp:cNvGraphicFramePr>
+            <a:graphic>
+              <a:graphicData uri="http://schemas.openxmlformats.org/drawingml/2006/picture">
+                <pic:pic>
+                  <pic:nvPicPr>
+                    <pic:cNvPr id="0" name="fig3b_params_vs_se.png"/>
+                    <pic:cNvPicPr/>
+                  </pic:nvPicPr>
+                  <pic:blipFill>
+                    <a:blip r:embed="rId27"/>
+                    <a:stretch>
+                      <a:fillRect/>
+                    </a:stretch>
+                  </pic:blipFill>
+                  <pic:spPr>
+                    <a:xfrm>
+                      <a:off x="0" y="0"/>
+                      <a:ext cx="5943600" cy="2377440"/>
+                    </a:xfrm>
+                    <a:prstGeom prst="rect"/>
+                  </pic:spPr>
+                </pic:pic>
+              </a:graphicData>
+            </a:graphic>
+          </wp:inline>
+        </w:drawing>
+      </w:r>
+    </w:p>
+    <w:p>
+      <w:pPr>
+        <w:spacing w:before="40" w:after="120"/>
+        <w:jc w:val="center"/>
+      </w:pPr>
+      <w:r>
+        <w:rPr>
+          <w:i/>
+          <w:sz w:val="18"/>
+        </w:rPr>
+        <w:t>Fig 3b. Policy parameters vs per-run SE score: speed (left), grid resolution (centre), and obstacle inflation factor (right). Dashed vertical lines mark each model’s target parameter value; each point is one simulation run.</w:t>
+      </w:r>
+    </w:p>
+    <w:p>
+      <w:pPr>
+        <w:spacing w:before="120" w:after="40"/>
+        <w:ind w:left="283"/>
+      </w:pPr>
+      <w:r>
+        <w:rPr>
+          <w:b/>
+          <w:color w:val="143C6D"/>
+          <w:sz w:val="20"/>
+        </w:rPr>
+        <w:t>What this figure shows</w:t>
+      </w:r>
+    </w:p>
+    <w:p>
+      <w:pPr>
+        <w:spacing w:before="40" w:after="160"/>
+        <w:ind w:left="283" w:right="283"/>
+        <w:shd w:val="clear" w:color="auto" w:fill="F2F6FC"/>
+      </w:pPr>
+      <w:r>
+        <w:rPr>
+          <w:sz w:val="20"/>
+        </w:rPr>
+        <w:t xml:space="preserve">Fig 3b plots each of the three policy parameters — speed, grid resolution, and obstacle inflation — against per-run SE score for all 180 runs (20 runs × 3 environments × 3 models). Each scatter point is one run; colour indicates model; shape indicates environment (circle=Domestic, square=Mix, triangle=Warehouse). Dashed vertical lines mark each model’s target parameter value (M0 orange, M1 blue, M2 green). For M0 and M1, parameters are fixed throughout; for M2, the x-axis shows the per-run effective average (EMA-smoothed, varying by DST mode mix).</w:t>
+      </w:r>
+    </w:p>
+    <w:p>
+      <w:pPr>
+        <w:spacing w:before="120" w:after="40"/>
+        <w:ind w:left="283"/>
+      </w:pPr>
+      <w:r>
+        <w:rPr>
+          <w:b/>
+          <w:color w:val="143C6D"/>
+          <w:sz w:val="20"/>
+        </w:rPr>
+        <w:t>What we conclude</w:t>
+      </w:r>
+    </w:p>
+    <w:p>
+      <w:pPr>
+        <w:spacing w:before="40" w:after="160"/>
+        <w:ind w:left="283" w:right="283"/>
+        <w:shd w:val="clear" w:color="auto" w:fill="F2F6FC"/>
+      </w:pPr>
+      <w:r>
+        <w:rPr>
+          <w:sz w:val="20"/>
+        </w:rPr>
+        <w:t xml:space="preserve">No single parameter predicts SE on its own — all three panels show large vertical scatter at every fixed parameter value. This is the central insight: SE is determined by the COMBINATION of speed, resolution, and inflation, not by any one alone. M2’s medical_care analogy positions it strategically across all three dimensions simultaneously: speed=0.58 (between M0=0.65 and M1=0.40), resolution=0.04 (finer than both M0=0.10 and M1=0.05), and inflation=1.20 (between M0=0.85 and M1=1.85). Crucially, M2’s resolution=0.04 is the finest of any model — this is what gives M2 smoother paths and lower jerk even in fast mode (as shown in Fig 2b). M0’s coarse 0.10 m grid routes it through tighter spaces, increasing obstacle proximity and spill risk. M1’s slow speed reduces risk but its 1.85 inflation factor creates very wide berths that lengthen paths and drain battery in complex environments. M2 avoids both failure modes by using an analogy-selected parameter set that is well-calibrated to the task.</w:t>
+      </w:r>
+    </w:p>
+    <w:p>
+      <w:pPr>
+        <w:spacing w:before="120" w:after="40"/>
+        <w:ind w:left="283"/>
+      </w:pPr>
+      <w:r>
+        <w:rPr>
+          <w:b/>
+          <w:color w:val="143C6D"/>
+          <w:sz w:val="20"/>
+        </w:rPr>
+        <w:t>Connection to the research problem</w:t>
+      </w:r>
+    </w:p>
+    <w:p>
+      <w:pPr>
+        <w:spacing w:before="40" w:after="160"/>
+        <w:ind w:left="283" w:right="283"/>
+        <w:shd w:val="clear" w:color="auto" w:fill="F2F6FC"/>
+      </w:pPr>
+      <w:r>
+        <w:rPr>
+          <w:sz w:val="20"/>
+        </w:rPr>
+        <w:t xml:space="preserve">Fig 3b closes the loop between the behavioural profiles in Fig 3 and the safety analysis in Figs 2–2b. Fig 3 showed M2’s wide speed range (adaptive) and lower jerk variance; Fig 2b showed the DST switch creates 13× risk reduction; Fig 3b now shows why the medical_care analogy parameter set is strategically superior — it occupies a unique position in parameter space (finest resolution, moderate speed, balanced inflation) that neither M0 nor M1 can access with fixed policies. The analogy-based meta-reasoning provides parameter values that a standard engineering search (grid optimisation over speed and inflation) would likely miss, because resolution’s effect is non-linear and context-dependent. This sets up Fig 4, which shows how DST beliefs dynamically adjust M2’s behaviour within this parameter envelope run by run.</w:t>
+      </w:r>
     </w:p>
     <w:p>
       <w:pPr>

</xml_diff>